<commit_message>
Update project reports and HMI files
</commit_message>
<xml_diff>
--- a/docs/fa/docx/SIM5300EA-DTMF-STM32F407-report.docx
+++ b/docs/fa/docx/SIM5300EA-DTMF-STM32F407-report.docx
@@ -182,7 +182,80 @@
           <w:szCs w:val="26"/>
           <w:rtl w:val="true"/>
         </w:rPr>
-        <w:t xml:space="preserve">در گزارش قبلی، ساختار اولیه سیستم کنترل </w:t>
+        <w:t xml:space="preserve">در گزارش </w:t>
+      </w:r>
+      <w:r>
+        <w:rPr>
+          <w:rFonts w:ascii="LM Roman Slanted 9" w:hAnsi="LM Roman Slanted 9" w:cs="LM Roman Slanted 9"/>
+          <w:b w:val="false"/>
+          <w:b w:val="false"/>
+          <w:i w:val="false"/>
+          <w:i w:val="false"/>
+          <w:sz w:val="26"/>
+          <w:sz w:val="26"/>
+          <w:szCs w:val="26"/>
+          <w:rtl w:val="true"/>
+        </w:rPr>
+        <w:t xml:space="preserve">فنی بررسی و راه اندازی اولیه ماژول </w:t>
+      </w:r>
+      <w:r>
+        <w:rPr>
+          <w:rFonts w:cs="LM Roman Slanted 9" w:ascii="LM Roman Slanted 9" w:hAnsi="LM Roman Slanted 9"/>
+          <w:b w:val="false"/>
+          <w:i w:val="false"/>
+          <w:sz w:val="26"/>
+          <w:szCs w:val="26"/>
+        </w:rPr>
+        <w:t>5300E</w:t>
+      </w:r>
+      <w:r>
+        <w:rPr>
+          <w:rFonts w:cs="LM Roman Slanted 9" w:ascii="LM Roman Slanted 9" w:hAnsi="LM Roman Slanted 9"/>
+          <w:b w:val="false"/>
+          <w:i w:val="false"/>
+          <w:sz w:val="26"/>
+          <w:szCs w:val="26"/>
+          <w:rtl w:val="true"/>
+        </w:rPr>
+        <w:t xml:space="preserve"> </w:t>
+      </w:r>
+      <w:r>
+        <w:rPr>
+          <w:rFonts w:ascii="LM Roman Slanted 9" w:hAnsi="LM Roman Slanted 9" w:cs="LM Roman Slanted 9"/>
+          <w:b w:val="false"/>
+          <w:b w:val="false"/>
+          <w:i w:val="false"/>
+          <w:i w:val="false"/>
+          <w:sz w:val="26"/>
+          <w:sz w:val="26"/>
+          <w:szCs w:val="26"/>
+          <w:rtl w:val="true"/>
+        </w:rPr>
+        <w:t xml:space="preserve">با برد </w:t>
+      </w:r>
+      <w:r>
+        <w:rPr>
+          <w:rFonts w:cs="LM Roman Slanted 9" w:ascii="LM Roman Slanted 9" w:hAnsi="LM Roman Slanted 9"/>
+          <w:b w:val="false"/>
+          <w:i w:val="false"/>
+          <w:sz w:val="26"/>
+          <w:szCs w:val="26"/>
+        </w:rPr>
+        <w:t>STM32F407</w:t>
+      </w:r>
+      <w:r>
+        <w:rPr>
+          <w:rFonts w:ascii="LM Roman Slanted 9" w:hAnsi="LM Roman Slanted 9" w:cs="LM Roman Slanted 9"/>
+          <w:b w:val="false"/>
+          <w:b w:val="false"/>
+          <w:i w:val="false"/>
+          <w:i w:val="false"/>
+          <w:sz w:val="26"/>
+          <w:sz w:val="26"/>
+          <w:szCs w:val="26"/>
+          <w:rtl w:val="true"/>
+        </w:rPr>
+        <w:t xml:space="preserve">، ساختار اولیه سیستم کنترل </w:t>
       </w:r>
       <w:r>
         <w:rPr>
@@ -5635,8 +5708,1190 @@
     </w:p>
     <w:p>
       <w:pPr>
+        <w:pStyle w:val="Heading3"/>
+        <w:bidi w:val="1"/>
+        <w:spacing w:before="0" w:after="0"/>
+        <w:jc w:val="both"/>
+        <w:rPr>
+          <w:rFonts w:ascii="LM Roman Slanted 9" w:hAnsi="LM Roman Slanted 9" w:cs="LM Roman Slanted 9"/>
+          <w:b/>
+          <w:i w:val="false"/>
+          <w:i w:val="false"/>
+          <w:color w:val="000000"/>
+          <w:sz w:val="26"/>
+          <w:szCs w:val="26"/>
+        </w:rPr>
+      </w:pPr>
+      <w:r>
+        <w:rPr>
+          <w:rFonts w:ascii="LM Roman Slanted 9" w:hAnsi="LM Roman Slanted 9" w:cs="LM Roman Slanted 9"/>
+          <w:b/>
+          <w:b/>
+          <w:i w:val="false"/>
+          <w:i w:val="false"/>
+          <w:color w:val="000000"/>
+          <w:sz w:val="26"/>
+          <w:sz w:val="26"/>
+          <w:szCs w:val="26"/>
+        </w:rPr>
+        <w:t>۶</w:t>
+      </w:r>
+      <w:r>
+        <w:rPr>
+          <w:rFonts w:cs="LM Roman Slanted 9" w:ascii="LM Roman Slanted 9" w:hAnsi="LM Roman Slanted 9"/>
+          <w:b/>
+          <w:i w:val="false"/>
+          <w:color w:val="000000"/>
+          <w:sz w:val="26"/>
+          <w:szCs w:val="26"/>
+          <w:rtl w:val="true"/>
+        </w:rPr>
+        <w:t xml:space="preserve">- </w:t>
+      </w:r>
+      <w:r>
+        <w:rPr>
+          <w:rFonts w:ascii="LM Roman Slanted 9" w:hAnsi="LM Roman Slanted 9" w:cs="LM Roman Slanted 9"/>
+          <w:b/>
+          <w:b/>
+          <w:i w:val="false"/>
+          <w:i w:val="false"/>
+          <w:color w:val="000000"/>
+          <w:sz w:val="26"/>
+          <w:sz w:val="26"/>
+          <w:szCs w:val="26"/>
+          <w:rtl w:val="true"/>
+        </w:rPr>
+        <w:t xml:space="preserve">روش پیشنهادی نهایی برای تشخیص </w:t>
+      </w:r>
+      <w:r>
+        <w:rPr>
+          <w:rFonts w:cs="LM Roman Slanted 9" w:ascii="LM Roman Slanted 9" w:hAnsi="LM Roman Slanted 9"/>
+          <w:b/>
+          <w:i w:val="false"/>
+          <w:color w:val="000000"/>
+          <w:sz w:val="26"/>
+          <w:szCs w:val="26"/>
+        </w:rPr>
+        <w:t>DTMF</w:t>
+      </w:r>
+    </w:p>
+    <w:p>
+      <w:pPr>
+        <w:pStyle w:val="BodyText"/>
+        <w:bidi w:val="1"/>
+        <w:jc w:val="both"/>
+        <w:rPr/>
+      </w:pPr>
+      <w:r>
+        <w:rPr>
+          <w:rFonts w:ascii="LM Roman Slanted 9" w:hAnsi="LM Roman Slanted 9" w:cs="LM Roman Slanted 9"/>
+          <w:sz w:val="22"/>
+          <w:sz w:val="22"/>
+          <w:szCs w:val="22"/>
+          <w:rtl w:val="true"/>
+        </w:rPr>
+        <w:t xml:space="preserve">با توجه به بررسی روش‌های مختلف، در این پروژه استفاده از </w:t>
+      </w:r>
+      <w:r>
+        <w:rPr>
+          <w:rStyle w:val="Strong"/>
+          <w:rFonts w:ascii="LM Roman Slanted 9" w:hAnsi="LM Roman Slanted 9" w:cs="LM Roman Slanted 9"/>
+          <w:sz w:val="22"/>
+          <w:sz w:val="22"/>
+          <w:szCs w:val="22"/>
+          <w:rtl w:val="true"/>
+        </w:rPr>
+        <w:t xml:space="preserve">دیکودر سخت‌افزاری </w:t>
+      </w:r>
+      <w:r>
+        <w:rPr>
+          <w:rStyle w:val="Strong"/>
+          <w:rFonts w:cs="LM Roman Slanted 9" w:ascii="LM Roman Slanted 9" w:hAnsi="LM Roman Slanted 9"/>
+          <w:sz w:val="22"/>
+          <w:szCs w:val="22"/>
+        </w:rPr>
+        <w:t>MT8870</w:t>
+      </w:r>
+      <w:r>
+        <w:rPr>
+          <w:rFonts w:cs="LM Roman Slanted 9" w:ascii="LM Roman Slanted 9" w:hAnsi="LM Roman Slanted 9"/>
+          <w:sz w:val="22"/>
+          <w:szCs w:val="22"/>
+          <w:rtl w:val="true"/>
+        </w:rPr>
+        <w:t xml:space="preserve"> </w:t>
+      </w:r>
+      <w:r>
+        <w:rPr>
+          <w:rFonts w:ascii="LM Roman Slanted 9" w:hAnsi="LM Roman Slanted 9" w:cs="LM Roman Slanted 9"/>
+          <w:sz w:val="22"/>
+          <w:sz w:val="22"/>
+          <w:szCs w:val="22"/>
+          <w:rtl w:val="true"/>
+        </w:rPr>
+        <w:t xml:space="preserve">به‌عنوان روش پیشنهادی برای تشخیص سیگنال‌های </w:t>
+      </w:r>
+      <w:r>
+        <w:rPr>
+          <w:rFonts w:cs="LM Roman Slanted 9" w:ascii="LM Roman Slanted 9" w:hAnsi="LM Roman Slanted 9"/>
+          <w:sz w:val="22"/>
+          <w:szCs w:val="22"/>
+        </w:rPr>
+        <w:t>DTMF</w:t>
+      </w:r>
+      <w:r>
+        <w:rPr>
+          <w:rFonts w:cs="LM Roman Slanted 9" w:ascii="LM Roman Slanted 9" w:hAnsi="LM Roman Slanted 9"/>
+          <w:sz w:val="22"/>
+          <w:szCs w:val="22"/>
+          <w:rtl w:val="true"/>
+        </w:rPr>
+        <w:t xml:space="preserve"> </w:t>
+      </w:r>
+      <w:r>
+        <w:rPr>
+          <w:rFonts w:ascii="LM Roman Slanted 9" w:hAnsi="LM Roman Slanted 9" w:cs="LM Roman Slanted 9"/>
+          <w:sz w:val="22"/>
+          <w:sz w:val="22"/>
+          <w:szCs w:val="22"/>
+          <w:rtl w:val="true"/>
+        </w:rPr>
+        <w:t>انتخاب می‌شود</w:t>
+      </w:r>
+      <w:r>
+        <w:rPr>
+          <w:rFonts w:cs="LM Roman Slanted 9" w:ascii="LM Roman Slanted 9" w:hAnsi="LM Roman Slanted 9"/>
+          <w:sz w:val="22"/>
+          <w:szCs w:val="22"/>
+          <w:rtl w:val="true"/>
+        </w:rPr>
+        <w:t xml:space="preserve">. </w:t>
+      </w:r>
+      <w:r>
+        <w:rPr>
+          <w:rFonts w:ascii="LM Roman Slanted 9" w:hAnsi="LM Roman Slanted 9" w:cs="LM Roman Slanted 9"/>
+          <w:sz w:val="22"/>
+          <w:sz w:val="22"/>
+          <w:szCs w:val="22"/>
+          <w:rtl w:val="true"/>
+        </w:rPr>
+        <w:t>دلیل اصلی این انتخاب، سادگی پیاده‌سازی و عدم نیاز به نمونه‌برداری و پردازش نرم‌افزاری سیگنال صوتی در میکروکنترلر است</w:t>
+      </w:r>
+      <w:r>
+        <w:rPr>
+          <w:rFonts w:cs="LM Roman Slanted 9" w:ascii="LM Roman Slanted 9" w:hAnsi="LM Roman Slanted 9"/>
+          <w:sz w:val="22"/>
+          <w:szCs w:val="22"/>
+          <w:rtl w:val="true"/>
+        </w:rPr>
+        <w:t>.</w:t>
+      </w:r>
+    </w:p>
+    <w:p>
+      <w:pPr>
+        <w:pStyle w:val="BodyText"/>
+        <w:bidi w:val="1"/>
+        <w:jc w:val="both"/>
+        <w:rPr/>
+      </w:pPr>
+      <w:r>
+        <w:rPr>
+          <w:rFonts w:ascii="LM Roman Slanted 9" w:hAnsi="LM Roman Slanted 9" w:cs="LM Roman Slanted 9"/>
+          <w:sz w:val="22"/>
+          <w:sz w:val="22"/>
+          <w:szCs w:val="22"/>
+          <w:rtl w:val="true"/>
+        </w:rPr>
+        <w:t xml:space="preserve">در این روش، سیگنال صوتی تماس از خروجی صوتی ماژول </w:t>
+      </w:r>
+      <w:r>
+        <w:rPr>
+          <w:rStyle w:val="Strong"/>
+          <w:rFonts w:cs="LM Roman Slanted 9" w:ascii="LM Roman Slanted 9" w:hAnsi="LM Roman Slanted 9"/>
+          <w:sz w:val="22"/>
+          <w:szCs w:val="22"/>
+        </w:rPr>
+        <w:t>SIM5300EA</w:t>
+      </w:r>
+      <w:r>
+        <w:rPr>
+          <w:rFonts w:cs="LM Roman Slanted 9" w:ascii="LM Roman Slanted 9" w:hAnsi="LM Roman Slanted 9"/>
+          <w:sz w:val="22"/>
+          <w:szCs w:val="22"/>
+          <w:rtl w:val="true"/>
+        </w:rPr>
+        <w:t xml:space="preserve"> </w:t>
+      </w:r>
+      <w:r>
+        <w:rPr>
+          <w:rFonts w:ascii="LM Roman Slanted 9" w:hAnsi="LM Roman Slanted 9" w:cs="LM Roman Slanted 9"/>
+          <w:sz w:val="22"/>
+          <w:sz w:val="22"/>
+          <w:szCs w:val="22"/>
+          <w:rtl w:val="true"/>
+        </w:rPr>
+        <w:t xml:space="preserve">دریافت شده و پس از عبور از یک مدار واسط مناسب برای تنظیم سطح سیگنال، به ورودی </w:t>
+      </w:r>
+      <w:r>
+        <w:rPr>
+          <w:rFonts w:cs="LM Roman Slanted 9" w:ascii="LM Roman Slanted 9" w:hAnsi="LM Roman Slanted 9"/>
+          <w:sz w:val="22"/>
+          <w:szCs w:val="22"/>
+        </w:rPr>
+        <w:t>MT8870</w:t>
+      </w:r>
+      <w:r>
+        <w:rPr>
+          <w:rFonts w:cs="LM Roman Slanted 9" w:ascii="LM Roman Slanted 9" w:hAnsi="LM Roman Slanted 9"/>
+          <w:sz w:val="22"/>
+          <w:szCs w:val="22"/>
+          <w:rtl w:val="true"/>
+        </w:rPr>
+        <w:t xml:space="preserve"> </w:t>
+      </w:r>
+      <w:r>
+        <w:rPr>
+          <w:rFonts w:ascii="LM Roman Slanted 9" w:hAnsi="LM Roman Slanted 9" w:cs="LM Roman Slanted 9"/>
+          <w:sz w:val="22"/>
+          <w:sz w:val="22"/>
+          <w:szCs w:val="22"/>
+          <w:rtl w:val="true"/>
+        </w:rPr>
+        <w:t>اعمال می‌شود</w:t>
+      </w:r>
+      <w:r>
+        <w:rPr>
+          <w:rFonts w:cs="LM Roman Slanted 9" w:ascii="LM Roman Slanted 9" w:hAnsi="LM Roman Slanted 9"/>
+          <w:sz w:val="22"/>
+          <w:szCs w:val="22"/>
+          <w:rtl w:val="true"/>
+        </w:rPr>
+        <w:t xml:space="preserve">. </w:t>
+      </w:r>
+      <w:r>
+        <w:rPr>
+          <w:rFonts w:cs="LM Roman Slanted 9" w:ascii="LM Roman Slanted 9" w:hAnsi="LM Roman Slanted 9"/>
+          <w:sz w:val="22"/>
+          <w:szCs w:val="22"/>
+        </w:rPr>
+        <w:t>MT8870</w:t>
+      </w:r>
+      <w:r>
+        <w:rPr>
+          <w:rFonts w:cs="LM Roman Slanted 9" w:ascii="LM Roman Slanted 9" w:hAnsi="LM Roman Slanted 9"/>
+          <w:sz w:val="22"/>
+          <w:szCs w:val="22"/>
+          <w:rtl w:val="true"/>
+        </w:rPr>
+        <w:t xml:space="preserve"> </w:t>
+      </w:r>
+      <w:r>
+        <w:rPr>
+          <w:rFonts w:ascii="LM Roman Slanted 9" w:hAnsi="LM Roman Slanted 9" w:cs="LM Roman Slanted 9"/>
+          <w:sz w:val="22"/>
+          <w:sz w:val="22"/>
+          <w:szCs w:val="22"/>
+          <w:rtl w:val="true"/>
+        </w:rPr>
+        <w:t xml:space="preserve">دو فرکانس تشکیل‌دهنده هر کلید </w:t>
+      </w:r>
+      <w:r>
+        <w:rPr>
+          <w:rFonts w:cs="LM Roman Slanted 9" w:ascii="LM Roman Slanted 9" w:hAnsi="LM Roman Slanted 9"/>
+          <w:sz w:val="22"/>
+          <w:szCs w:val="22"/>
+        </w:rPr>
+        <w:t>DTMF</w:t>
+      </w:r>
+      <w:r>
+        <w:rPr>
+          <w:rFonts w:cs="LM Roman Slanted 9" w:ascii="LM Roman Slanted 9" w:hAnsi="LM Roman Slanted 9"/>
+          <w:sz w:val="22"/>
+          <w:szCs w:val="22"/>
+          <w:rtl w:val="true"/>
+        </w:rPr>
+        <w:t xml:space="preserve"> </w:t>
+      </w:r>
+      <w:r>
+        <w:rPr>
+          <w:rFonts w:ascii="LM Roman Slanted 9" w:hAnsi="LM Roman Slanted 9" w:cs="LM Roman Slanted 9"/>
+          <w:sz w:val="22"/>
+          <w:sz w:val="22"/>
+          <w:szCs w:val="22"/>
+          <w:rtl w:val="true"/>
+        </w:rPr>
+        <w:t xml:space="preserve">را تشخیص داده و نتیجه را به‌صورت یک کد دیجیتال چهار بیتی در پایه‌های </w:t>
+      </w:r>
+      <w:r>
+        <w:rPr>
+          <w:rStyle w:val="Strong"/>
+          <w:rFonts w:cs="LM Roman Slanted 9" w:ascii="LM Roman Slanted 9" w:hAnsi="LM Roman Slanted 9"/>
+          <w:sz w:val="22"/>
+          <w:szCs w:val="22"/>
+        </w:rPr>
+        <w:t>Q1</w:t>
+      </w:r>
+      <w:r>
+        <w:rPr>
+          <w:rStyle w:val="Strong"/>
+          <w:rFonts w:cs="LM Roman Slanted 9" w:ascii="LM Roman Slanted 9" w:hAnsi="LM Roman Slanted 9"/>
+          <w:sz w:val="22"/>
+          <w:szCs w:val="22"/>
+          <w:rtl w:val="true"/>
+        </w:rPr>
+        <w:t xml:space="preserve"> </w:t>
+      </w:r>
+      <w:r>
+        <w:rPr>
+          <w:rStyle w:val="Strong"/>
+          <w:rFonts w:ascii="LM Roman Slanted 9" w:hAnsi="LM Roman Slanted 9" w:cs="LM Roman Slanted 9"/>
+          <w:sz w:val="22"/>
+          <w:sz w:val="22"/>
+          <w:szCs w:val="22"/>
+          <w:rtl w:val="true"/>
+        </w:rPr>
+        <w:t xml:space="preserve">تا </w:t>
+      </w:r>
+      <w:r>
+        <w:rPr>
+          <w:rStyle w:val="Strong"/>
+          <w:rFonts w:cs="LM Roman Slanted 9" w:ascii="LM Roman Slanted 9" w:hAnsi="LM Roman Slanted 9"/>
+          <w:sz w:val="22"/>
+          <w:szCs w:val="22"/>
+        </w:rPr>
+        <w:t>Q4</w:t>
+      </w:r>
+      <w:r>
+        <w:rPr>
+          <w:rFonts w:cs="LM Roman Slanted 9" w:ascii="LM Roman Slanted 9" w:hAnsi="LM Roman Slanted 9"/>
+          <w:sz w:val="22"/>
+          <w:szCs w:val="22"/>
+          <w:rtl w:val="true"/>
+        </w:rPr>
+        <w:t xml:space="preserve"> </w:t>
+      </w:r>
+      <w:r>
+        <w:rPr>
+          <w:rFonts w:ascii="LM Roman Slanted 9" w:hAnsi="LM Roman Slanted 9" w:cs="LM Roman Slanted 9"/>
+          <w:sz w:val="22"/>
+          <w:sz w:val="22"/>
+          <w:szCs w:val="22"/>
+          <w:rtl w:val="true"/>
+        </w:rPr>
+        <w:t>ارائه می‌کند</w:t>
+      </w:r>
+      <w:r>
+        <w:rPr>
+          <w:rFonts w:cs="LM Roman Slanted 9" w:ascii="LM Roman Slanted 9" w:hAnsi="LM Roman Slanted 9"/>
+          <w:sz w:val="22"/>
+          <w:szCs w:val="22"/>
+          <w:rtl w:val="true"/>
+        </w:rPr>
+        <w:t>.</w:t>
+      </w:r>
+    </w:p>
+    <w:p>
+      <w:pPr>
+        <w:pStyle w:val="BodyText"/>
+        <w:bidi w:val="1"/>
+        <w:jc w:val="both"/>
+        <w:rPr/>
+      </w:pPr>
+      <w:r>
+        <w:rPr>
+          <w:rFonts w:ascii="LM Roman Slanted 9" w:hAnsi="LM Roman Slanted 9" w:cs="LM Roman Slanted 9"/>
+          <w:sz w:val="22"/>
+          <w:sz w:val="22"/>
+          <w:szCs w:val="22"/>
+          <w:rtl w:val="true"/>
+        </w:rPr>
+        <w:t xml:space="preserve">علاوه بر این، سیگنال </w:t>
+      </w:r>
+      <w:r>
+        <w:rPr>
+          <w:rStyle w:val="Strong"/>
+          <w:rFonts w:cs="LM Roman Slanted 9" w:ascii="LM Roman Slanted 9" w:hAnsi="LM Roman Slanted 9"/>
+          <w:sz w:val="22"/>
+          <w:szCs w:val="22"/>
+        </w:rPr>
+        <w:t>STD</w:t>
+      </w:r>
+      <w:r>
+        <w:rPr>
+          <w:rFonts w:cs="LM Roman Slanted 9" w:ascii="LM Roman Slanted 9" w:hAnsi="LM Roman Slanted 9"/>
+          <w:sz w:val="22"/>
+          <w:szCs w:val="22"/>
+          <w:rtl w:val="true"/>
+        </w:rPr>
+        <w:t xml:space="preserve"> </w:t>
+      </w:r>
+      <w:r>
+        <w:rPr>
+          <w:rFonts w:ascii="LM Roman Slanted 9" w:hAnsi="LM Roman Slanted 9" w:cs="LM Roman Slanted 9"/>
+          <w:sz w:val="22"/>
+          <w:sz w:val="22"/>
+          <w:szCs w:val="22"/>
+          <w:rtl w:val="true"/>
+        </w:rPr>
+        <w:t xml:space="preserve">در </w:t>
+      </w:r>
+      <w:r>
+        <w:rPr>
+          <w:rFonts w:cs="LM Roman Slanted 9" w:ascii="LM Roman Slanted 9" w:hAnsi="LM Roman Slanted 9"/>
+          <w:sz w:val="22"/>
+          <w:szCs w:val="22"/>
+        </w:rPr>
+        <w:t>MT8870</w:t>
+      </w:r>
+      <w:r>
+        <w:rPr>
+          <w:rFonts w:cs="LM Roman Slanted 9" w:ascii="LM Roman Slanted 9" w:hAnsi="LM Roman Slanted 9"/>
+          <w:sz w:val="22"/>
+          <w:szCs w:val="22"/>
+          <w:rtl w:val="true"/>
+        </w:rPr>
+        <w:t xml:space="preserve"> </w:t>
+      </w:r>
+      <w:r>
+        <w:rPr>
+          <w:rFonts w:ascii="LM Roman Slanted 9" w:hAnsi="LM Roman Slanted 9" w:cs="LM Roman Slanted 9"/>
+          <w:sz w:val="22"/>
+          <w:sz w:val="22"/>
+          <w:szCs w:val="22"/>
+          <w:rtl w:val="true"/>
+        </w:rPr>
+        <w:t xml:space="preserve">می‌تواند برای مشخص‌کردن معتبر بودن دریافت یک کد </w:t>
+      </w:r>
+      <w:r>
+        <w:rPr>
+          <w:rFonts w:cs="LM Roman Slanted 9" w:ascii="LM Roman Slanted 9" w:hAnsi="LM Roman Slanted 9"/>
+          <w:sz w:val="22"/>
+          <w:szCs w:val="22"/>
+        </w:rPr>
+        <w:t>DTMF</w:t>
+      </w:r>
+      <w:r>
+        <w:rPr>
+          <w:rFonts w:cs="LM Roman Slanted 9" w:ascii="LM Roman Slanted 9" w:hAnsi="LM Roman Slanted 9"/>
+          <w:sz w:val="22"/>
+          <w:szCs w:val="22"/>
+          <w:rtl w:val="true"/>
+        </w:rPr>
+        <w:t xml:space="preserve"> </w:t>
+      </w:r>
+      <w:r>
+        <w:rPr>
+          <w:rFonts w:ascii="LM Roman Slanted 9" w:hAnsi="LM Roman Slanted 9" w:cs="LM Roman Slanted 9"/>
+          <w:sz w:val="22"/>
+          <w:sz w:val="22"/>
+          <w:szCs w:val="22"/>
+          <w:rtl w:val="true"/>
+        </w:rPr>
+        <w:t>استفاده شود</w:t>
+      </w:r>
+      <w:r>
+        <w:rPr>
+          <w:rFonts w:cs="LM Roman Slanted 9" w:ascii="LM Roman Slanted 9" w:hAnsi="LM Roman Slanted 9"/>
+          <w:sz w:val="22"/>
+          <w:szCs w:val="22"/>
+          <w:rtl w:val="true"/>
+        </w:rPr>
+        <w:t xml:space="preserve">. </w:t>
+      </w:r>
+      <w:r>
+        <w:rPr>
+          <w:rFonts w:ascii="LM Roman Slanted 9" w:hAnsi="LM Roman Slanted 9" w:cs="LM Roman Slanted 9"/>
+          <w:sz w:val="22"/>
+          <w:sz w:val="22"/>
+          <w:szCs w:val="22"/>
+          <w:rtl w:val="true"/>
+        </w:rPr>
+        <w:t xml:space="preserve">خروجی‌های </w:t>
+      </w:r>
+      <w:r>
+        <w:rPr>
+          <w:rFonts w:cs="LM Roman Slanted 9" w:ascii="LM Roman Slanted 9" w:hAnsi="LM Roman Slanted 9"/>
+          <w:sz w:val="22"/>
+          <w:szCs w:val="22"/>
+        </w:rPr>
+        <w:t>Q1</w:t>
+      </w:r>
+      <w:r>
+        <w:rPr>
+          <w:rFonts w:cs="LM Roman Slanted 9" w:ascii="LM Roman Slanted 9" w:hAnsi="LM Roman Slanted 9"/>
+          <w:sz w:val="22"/>
+          <w:szCs w:val="22"/>
+          <w:rtl w:val="true"/>
+        </w:rPr>
+        <w:t xml:space="preserve"> </w:t>
+      </w:r>
+      <w:r>
+        <w:rPr>
+          <w:rFonts w:ascii="LM Roman Slanted 9" w:hAnsi="LM Roman Slanted 9" w:cs="LM Roman Slanted 9"/>
+          <w:sz w:val="22"/>
+          <w:sz w:val="22"/>
+          <w:szCs w:val="22"/>
+          <w:rtl w:val="true"/>
+        </w:rPr>
+        <w:t xml:space="preserve">تا </w:t>
+      </w:r>
+      <w:r>
+        <w:rPr>
+          <w:rFonts w:cs="LM Roman Slanted 9" w:ascii="LM Roman Slanted 9" w:hAnsi="LM Roman Slanted 9"/>
+          <w:sz w:val="22"/>
+          <w:szCs w:val="22"/>
+        </w:rPr>
+        <w:t>Q4</w:t>
+      </w:r>
+      <w:r>
+        <w:rPr>
+          <w:rFonts w:cs="LM Roman Slanted 9" w:ascii="LM Roman Slanted 9" w:hAnsi="LM Roman Slanted 9"/>
+          <w:sz w:val="22"/>
+          <w:szCs w:val="22"/>
+          <w:rtl w:val="true"/>
+        </w:rPr>
+        <w:t xml:space="preserve"> </w:t>
+      </w:r>
+      <w:r>
+        <w:rPr>
+          <w:rFonts w:ascii="LM Roman Slanted 9" w:hAnsi="LM Roman Slanted 9" w:cs="LM Roman Slanted 9"/>
+          <w:sz w:val="22"/>
+          <w:sz w:val="22"/>
+          <w:szCs w:val="22"/>
+          <w:rtl w:val="true"/>
+        </w:rPr>
+        <w:t xml:space="preserve">و </w:t>
+      </w:r>
+      <w:r>
+        <w:rPr>
+          <w:rFonts w:cs="LM Roman Slanted 9" w:ascii="LM Roman Slanted 9" w:hAnsi="LM Roman Slanted 9"/>
+          <w:sz w:val="22"/>
+          <w:szCs w:val="22"/>
+        </w:rPr>
+        <w:t>STD</w:t>
+      </w:r>
+      <w:r>
+        <w:rPr>
+          <w:rFonts w:cs="LM Roman Slanted 9" w:ascii="LM Roman Slanted 9" w:hAnsi="LM Roman Slanted 9"/>
+          <w:sz w:val="22"/>
+          <w:szCs w:val="22"/>
+          <w:rtl w:val="true"/>
+        </w:rPr>
+        <w:t xml:space="preserve"> </w:t>
+      </w:r>
+      <w:r>
+        <w:rPr>
+          <w:rFonts w:ascii="LM Roman Slanted 9" w:hAnsi="LM Roman Slanted 9" w:cs="LM Roman Slanted 9"/>
+          <w:sz w:val="22"/>
+          <w:sz w:val="22"/>
+          <w:szCs w:val="22"/>
+          <w:rtl w:val="true"/>
+        </w:rPr>
+        <w:t xml:space="preserve">به پایه‌های </w:t>
+      </w:r>
+      <w:r>
+        <w:rPr>
+          <w:rFonts w:cs="LM Roman Slanted 9" w:ascii="LM Roman Slanted 9" w:hAnsi="LM Roman Slanted 9"/>
+          <w:sz w:val="22"/>
+          <w:szCs w:val="22"/>
+        </w:rPr>
+        <w:t>GPIO</w:t>
+      </w:r>
+      <w:r>
+        <w:rPr>
+          <w:rFonts w:cs="LM Roman Slanted 9" w:ascii="LM Roman Slanted 9" w:hAnsi="LM Roman Slanted 9"/>
+          <w:sz w:val="22"/>
+          <w:szCs w:val="22"/>
+          <w:rtl w:val="true"/>
+        </w:rPr>
+        <w:t xml:space="preserve"> </w:t>
+      </w:r>
+      <w:r>
+        <w:rPr>
+          <w:rFonts w:ascii="LM Roman Slanted 9" w:hAnsi="LM Roman Slanted 9" w:cs="LM Roman Slanted 9"/>
+          <w:sz w:val="22"/>
+          <w:sz w:val="22"/>
+          <w:szCs w:val="22"/>
+          <w:rtl w:val="true"/>
+        </w:rPr>
+        <w:t xml:space="preserve">میکروکنترلر </w:t>
+      </w:r>
+      <w:r>
+        <w:rPr>
+          <w:rStyle w:val="Strong"/>
+          <w:rFonts w:cs="LM Roman Slanted 9" w:ascii="LM Roman Slanted 9" w:hAnsi="LM Roman Slanted 9"/>
+          <w:sz w:val="22"/>
+          <w:szCs w:val="22"/>
+        </w:rPr>
+        <w:t>STM32F407</w:t>
+      </w:r>
+      <w:r>
+        <w:rPr>
+          <w:rFonts w:cs="LM Roman Slanted 9" w:ascii="LM Roman Slanted 9" w:hAnsi="LM Roman Slanted 9"/>
+          <w:sz w:val="22"/>
+          <w:szCs w:val="22"/>
+          <w:rtl w:val="true"/>
+        </w:rPr>
+        <w:t xml:space="preserve"> </w:t>
+      </w:r>
+      <w:r>
+        <w:rPr>
+          <w:rFonts w:ascii="LM Roman Slanted 9" w:hAnsi="LM Roman Slanted 9" w:cs="LM Roman Slanted 9"/>
+          <w:sz w:val="22"/>
+          <w:sz w:val="22"/>
+          <w:szCs w:val="22"/>
+          <w:rtl w:val="true"/>
+        </w:rPr>
+        <w:t xml:space="preserve">متصل می‌شوند و میکروکنترلر پس از دریافت کد، کلید فشرده‌شده را تشخیص داده و عملیات موردنظر، مانند روشن یا خاموش‌کردن </w:t>
+      </w:r>
+      <w:r>
+        <w:rPr>
+          <w:rFonts w:cs="LM Roman Slanted 9" w:ascii="LM Roman Slanted 9" w:hAnsi="LM Roman Slanted 9"/>
+          <w:sz w:val="22"/>
+          <w:szCs w:val="22"/>
+        </w:rPr>
+        <w:t>LED</w:t>
+      </w:r>
+      <w:r>
+        <w:rPr>
+          <w:rFonts w:ascii="LM Roman Slanted 9" w:hAnsi="LM Roman Slanted 9" w:cs="LM Roman Slanted 9"/>
+          <w:sz w:val="22"/>
+          <w:sz w:val="22"/>
+          <w:szCs w:val="22"/>
+          <w:rtl w:val="true"/>
+        </w:rPr>
+        <w:t>، را انجام می‌دهد</w:t>
+      </w:r>
+      <w:r>
+        <w:rPr>
+          <w:rFonts w:cs="LM Roman Slanted 9" w:ascii="LM Roman Slanted 9" w:hAnsi="LM Roman Slanted 9"/>
+          <w:sz w:val="22"/>
+          <w:szCs w:val="22"/>
+          <w:rtl w:val="true"/>
+        </w:rPr>
+        <w:t>.</w:t>
+      </w:r>
+    </w:p>
+    <w:p>
+      <w:pPr>
+        <w:pStyle w:val="BodyText"/>
+        <w:bidi w:val="1"/>
+        <w:jc w:val="both"/>
+        <w:rPr>
+          <w:rFonts w:ascii="LM Roman Slanted 9" w:hAnsi="LM Roman Slanted 9" w:cs="LM Roman Slanted 9"/>
+          <w:sz w:val="22"/>
+          <w:szCs w:val="22"/>
+        </w:rPr>
+      </w:pPr>
+      <w:r>
+        <w:rPr>
+          <w:rFonts w:ascii="LM Roman Slanted 9" w:hAnsi="LM Roman Slanted 9" w:cs="LM Roman Slanted 9"/>
+          <w:sz w:val="22"/>
+          <w:sz w:val="22"/>
+          <w:szCs w:val="22"/>
+          <w:rtl w:val="true"/>
+        </w:rPr>
+        <w:t xml:space="preserve">ارتباط </w:t>
+      </w:r>
+      <w:r>
+        <w:rPr>
+          <w:rFonts w:cs="LM Roman Slanted 9" w:ascii="LM Roman Slanted 9" w:hAnsi="LM Roman Slanted 9"/>
+          <w:sz w:val="22"/>
+          <w:szCs w:val="22"/>
+        </w:rPr>
+        <w:t>UART</w:t>
+      </w:r>
+      <w:r>
+        <w:rPr>
+          <w:rFonts w:cs="LM Roman Slanted 9" w:ascii="LM Roman Slanted 9" w:hAnsi="LM Roman Slanted 9"/>
+          <w:sz w:val="22"/>
+          <w:szCs w:val="22"/>
+          <w:rtl w:val="true"/>
+        </w:rPr>
+        <w:t xml:space="preserve"> </w:t>
+      </w:r>
+      <w:r>
+        <w:rPr>
+          <w:rFonts w:ascii="LM Roman Slanted 9" w:hAnsi="LM Roman Slanted 9" w:cs="LM Roman Slanted 9"/>
+          <w:sz w:val="22"/>
+          <w:sz w:val="22"/>
+          <w:szCs w:val="22"/>
+          <w:rtl w:val="true"/>
+        </w:rPr>
+        <w:t xml:space="preserve">بین </w:t>
+      </w:r>
+      <w:r>
+        <w:rPr>
+          <w:rFonts w:cs="LM Roman Slanted 9" w:ascii="LM Roman Slanted 9" w:hAnsi="LM Roman Slanted 9"/>
+          <w:sz w:val="22"/>
+          <w:szCs w:val="22"/>
+        </w:rPr>
+        <w:t>STM32F407</w:t>
+      </w:r>
+      <w:r>
+        <w:rPr>
+          <w:rFonts w:cs="LM Roman Slanted 9" w:ascii="LM Roman Slanted 9" w:hAnsi="LM Roman Slanted 9"/>
+          <w:sz w:val="22"/>
+          <w:szCs w:val="22"/>
+          <w:rtl w:val="true"/>
+        </w:rPr>
+        <w:t xml:space="preserve"> </w:t>
+      </w:r>
+      <w:r>
+        <w:rPr>
+          <w:rFonts w:ascii="LM Roman Slanted 9" w:hAnsi="LM Roman Slanted 9" w:cs="LM Roman Slanted 9"/>
+          <w:sz w:val="22"/>
+          <w:sz w:val="22"/>
+          <w:szCs w:val="22"/>
+          <w:rtl w:val="true"/>
+        </w:rPr>
+        <w:t xml:space="preserve">و </w:t>
+      </w:r>
+      <w:r>
+        <w:rPr>
+          <w:rFonts w:cs="LM Roman Slanted 9" w:ascii="LM Roman Slanted 9" w:hAnsi="LM Roman Slanted 9"/>
+          <w:sz w:val="22"/>
+          <w:szCs w:val="22"/>
+        </w:rPr>
+        <w:t>SIM5300EA</w:t>
+      </w:r>
+      <w:r>
+        <w:rPr>
+          <w:rFonts w:cs="LM Roman Slanted 9" w:ascii="LM Roman Slanted 9" w:hAnsi="LM Roman Slanted 9"/>
+          <w:sz w:val="22"/>
+          <w:szCs w:val="22"/>
+          <w:rtl w:val="true"/>
+        </w:rPr>
+        <w:t xml:space="preserve"> </w:t>
+      </w:r>
+      <w:r>
+        <w:rPr>
+          <w:rFonts w:ascii="LM Roman Slanted 9" w:hAnsi="LM Roman Slanted 9" w:cs="LM Roman Slanted 9"/>
+          <w:sz w:val="22"/>
+          <w:sz w:val="22"/>
+          <w:szCs w:val="22"/>
+          <w:rtl w:val="true"/>
+        </w:rPr>
+        <w:t xml:space="preserve">نیز به‌صورت مستقل برای ارسال فرمان‌های </w:t>
+      </w:r>
+      <w:r>
+        <w:rPr>
+          <w:rFonts w:cs="LM Roman Slanted 9" w:ascii="LM Roman Slanted 9" w:hAnsi="LM Roman Slanted 9"/>
+          <w:sz w:val="22"/>
+          <w:szCs w:val="22"/>
+        </w:rPr>
+        <w:t>AT</w:t>
+      </w:r>
+      <w:r>
+        <w:rPr>
+          <w:rFonts w:cs="LM Roman Slanted 9" w:ascii="LM Roman Slanted 9" w:hAnsi="LM Roman Slanted 9"/>
+          <w:sz w:val="22"/>
+          <w:szCs w:val="22"/>
+          <w:rtl w:val="true"/>
+        </w:rPr>
+        <w:t xml:space="preserve"> </w:t>
+      </w:r>
+      <w:r>
+        <w:rPr>
+          <w:rFonts w:ascii="LM Roman Slanted 9" w:hAnsi="LM Roman Slanted 9" w:cs="LM Roman Slanted 9"/>
+          <w:sz w:val="22"/>
+          <w:sz w:val="22"/>
+          <w:szCs w:val="22"/>
+          <w:rtl w:val="true"/>
+        </w:rPr>
+        <w:t>و مدیریت وضعیت تماس استفاده می‌شود</w:t>
+      </w:r>
+      <w:r>
+        <w:rPr>
+          <w:rFonts w:cs="LM Roman Slanted 9" w:ascii="LM Roman Slanted 9" w:hAnsi="LM Roman Slanted 9"/>
+          <w:sz w:val="22"/>
+          <w:szCs w:val="22"/>
+          <w:rtl w:val="true"/>
+        </w:rPr>
+        <w:t xml:space="preserve">. </w:t>
+      </w:r>
+      <w:r>
+        <w:rPr>
+          <w:rFonts w:ascii="LM Roman Slanted 9" w:hAnsi="LM Roman Slanted 9" w:cs="LM Roman Slanted 9"/>
+          <w:sz w:val="22"/>
+          <w:sz w:val="22"/>
+          <w:szCs w:val="22"/>
+          <w:rtl w:val="true"/>
+        </w:rPr>
+        <w:t xml:space="preserve">بنابراین مسیر کنترل تماس و مسیر تشخیص </w:t>
+      </w:r>
+      <w:r>
+        <w:rPr>
+          <w:rFonts w:cs="LM Roman Slanted 9" w:ascii="LM Roman Slanted 9" w:hAnsi="LM Roman Slanted 9"/>
+          <w:sz w:val="22"/>
+          <w:szCs w:val="22"/>
+        </w:rPr>
+        <w:t>DTMF</w:t>
+      </w:r>
+      <w:r>
+        <w:rPr>
+          <w:rFonts w:cs="LM Roman Slanted 9" w:ascii="LM Roman Slanted 9" w:hAnsi="LM Roman Slanted 9"/>
+          <w:sz w:val="22"/>
+          <w:szCs w:val="22"/>
+          <w:rtl w:val="true"/>
+        </w:rPr>
+        <w:t xml:space="preserve"> </w:t>
+      </w:r>
+      <w:r>
+        <w:rPr>
+          <w:rFonts w:ascii="LM Roman Slanted 9" w:hAnsi="LM Roman Slanted 9" w:cs="LM Roman Slanted 9"/>
+          <w:sz w:val="22"/>
+          <w:sz w:val="22"/>
+          <w:szCs w:val="22"/>
+          <w:rtl w:val="true"/>
+        </w:rPr>
+        <w:t xml:space="preserve">از یکدیگر جدا هستند؛ </w:t>
+      </w:r>
+      <w:r>
+        <w:rPr>
+          <w:rFonts w:cs="LM Roman Slanted 9" w:ascii="LM Roman Slanted 9" w:hAnsi="LM Roman Slanted 9"/>
+          <w:sz w:val="22"/>
+          <w:szCs w:val="22"/>
+        </w:rPr>
+        <w:t>UART</w:t>
+      </w:r>
+      <w:r>
+        <w:rPr>
+          <w:rFonts w:cs="LM Roman Slanted 9" w:ascii="LM Roman Slanted 9" w:hAnsi="LM Roman Slanted 9"/>
+          <w:sz w:val="22"/>
+          <w:szCs w:val="22"/>
+          <w:rtl w:val="true"/>
+        </w:rPr>
+        <w:t xml:space="preserve"> </w:t>
+      </w:r>
+      <w:r>
+        <w:rPr>
+          <w:rFonts w:ascii="LM Roman Slanted 9" w:hAnsi="LM Roman Slanted 9" w:cs="LM Roman Slanted 9"/>
+          <w:sz w:val="22"/>
+          <w:sz w:val="22"/>
+          <w:szCs w:val="22"/>
+          <w:rtl w:val="true"/>
+        </w:rPr>
+        <w:t xml:space="preserve">وظیفه کنترل ماژول را بر عهده دارد و </w:t>
+      </w:r>
+      <w:r>
+        <w:rPr>
+          <w:rFonts w:cs="LM Roman Slanted 9" w:ascii="LM Roman Slanted 9" w:hAnsi="LM Roman Slanted 9"/>
+          <w:sz w:val="22"/>
+          <w:szCs w:val="22"/>
+        </w:rPr>
+        <w:t>MT8870</w:t>
+      </w:r>
+      <w:r>
+        <w:rPr>
+          <w:rFonts w:cs="LM Roman Slanted 9" w:ascii="LM Roman Slanted 9" w:hAnsi="LM Roman Slanted 9"/>
+          <w:sz w:val="22"/>
+          <w:szCs w:val="22"/>
+          <w:rtl w:val="true"/>
+        </w:rPr>
+        <w:t xml:space="preserve"> </w:t>
+      </w:r>
+      <w:r>
+        <w:rPr>
+          <w:rFonts w:ascii="LM Roman Slanted 9" w:hAnsi="LM Roman Slanted 9" w:cs="LM Roman Slanted 9"/>
+          <w:sz w:val="22"/>
+          <w:sz w:val="22"/>
+          <w:szCs w:val="22"/>
+          <w:rtl w:val="true"/>
+        </w:rPr>
+        <w:t xml:space="preserve">وظیفه تشخیص سیگنال </w:t>
+      </w:r>
+      <w:r>
+        <w:rPr>
+          <w:rFonts w:cs="LM Roman Slanted 9" w:ascii="LM Roman Slanted 9" w:hAnsi="LM Roman Slanted 9"/>
+          <w:sz w:val="22"/>
+          <w:szCs w:val="22"/>
+        </w:rPr>
+        <w:t>DTMF</w:t>
+      </w:r>
+      <w:r>
+        <w:rPr>
+          <w:rFonts w:cs="LM Roman Slanted 9" w:ascii="LM Roman Slanted 9" w:hAnsi="LM Roman Slanted 9"/>
+          <w:sz w:val="22"/>
+          <w:szCs w:val="22"/>
+          <w:rtl w:val="true"/>
+        </w:rPr>
+        <w:t xml:space="preserve"> </w:t>
+      </w:r>
+      <w:r>
+        <w:rPr>
+          <w:rFonts w:ascii="LM Roman Slanted 9" w:hAnsi="LM Roman Slanted 9" w:cs="LM Roman Slanted 9"/>
+          <w:sz w:val="22"/>
+          <w:sz w:val="22"/>
+          <w:szCs w:val="22"/>
+          <w:rtl w:val="true"/>
+        </w:rPr>
+        <w:t>موجود در مسیر صوتی را انجام می‌دهد</w:t>
+      </w:r>
+      <w:r>
+        <w:rPr>
+          <w:rFonts w:cs="LM Roman Slanted 9" w:ascii="LM Roman Slanted 9" w:hAnsi="LM Roman Slanted 9"/>
+          <w:sz w:val="22"/>
+          <w:szCs w:val="22"/>
+          <w:rtl w:val="true"/>
+        </w:rPr>
+        <w:t>.</w:t>
+      </w:r>
+    </w:p>
+    <w:p>
+      <w:pPr>
+        <w:pStyle w:val="BodyText"/>
+        <w:bidi w:val="1"/>
+        <w:jc w:val="both"/>
+        <w:rPr>
+          <w:rFonts w:ascii="LM Roman Slanted 9" w:hAnsi="LM Roman Slanted 9" w:cs="LM Roman Slanted 9"/>
+          <w:sz w:val="22"/>
+          <w:szCs w:val="22"/>
+        </w:rPr>
+      </w:pPr>
+      <w:r>
+        <w:rPr>
+          <w:rFonts w:ascii="LM Roman Slanted 9" w:hAnsi="LM Roman Slanted 9" w:cs="LM Roman Slanted 9"/>
+          <w:sz w:val="22"/>
+          <w:sz w:val="22"/>
+          <w:szCs w:val="22"/>
+          <w:rtl w:val="true"/>
+        </w:rPr>
+        <w:t xml:space="preserve">در مقایسه با روش تشخیص نرم‌افزاری مبتنی بر </w:t>
+      </w:r>
+      <w:r>
+        <w:rPr>
+          <w:rFonts w:cs="LM Roman Slanted 9" w:ascii="LM Roman Slanted 9" w:hAnsi="LM Roman Slanted 9"/>
+          <w:sz w:val="22"/>
+          <w:szCs w:val="22"/>
+        </w:rPr>
+        <w:t>ADC</w:t>
+      </w:r>
+      <w:r>
+        <w:rPr>
+          <w:rFonts w:cs="LM Roman Slanted 9" w:ascii="LM Roman Slanted 9" w:hAnsi="LM Roman Slanted 9"/>
+          <w:sz w:val="22"/>
+          <w:szCs w:val="22"/>
+          <w:rtl w:val="true"/>
+        </w:rPr>
+        <w:t xml:space="preserve"> </w:t>
+      </w:r>
+      <w:r>
+        <w:rPr>
+          <w:rFonts w:ascii="LM Roman Slanted 9" w:hAnsi="LM Roman Slanted 9" w:cs="LM Roman Slanted 9"/>
+          <w:sz w:val="22"/>
+          <w:sz w:val="22"/>
+          <w:szCs w:val="22"/>
+          <w:rtl w:val="true"/>
+        </w:rPr>
+        <w:t xml:space="preserve">و الگوریتم </w:t>
+      </w:r>
+      <w:r>
+        <w:rPr>
+          <w:rFonts w:cs="LM Roman Slanted 9" w:ascii="LM Roman Slanted 9" w:hAnsi="LM Roman Slanted 9"/>
+          <w:sz w:val="22"/>
+          <w:szCs w:val="22"/>
+        </w:rPr>
+        <w:t>Goertzel</w:t>
+      </w:r>
+      <w:r>
+        <w:rPr>
+          <w:rFonts w:ascii="LM Roman Slanted 9" w:hAnsi="LM Roman Slanted 9" w:cs="LM Roman Slanted 9"/>
+          <w:sz w:val="22"/>
+          <w:sz w:val="22"/>
+          <w:szCs w:val="22"/>
+          <w:rtl w:val="true"/>
+        </w:rPr>
+        <w:t xml:space="preserve">، این روش بار پردازشی کمتری به </w:t>
+      </w:r>
+      <w:r>
+        <w:rPr>
+          <w:rFonts w:cs="LM Roman Slanted 9" w:ascii="LM Roman Slanted 9" w:hAnsi="LM Roman Slanted 9"/>
+          <w:sz w:val="22"/>
+          <w:szCs w:val="22"/>
+        </w:rPr>
+        <w:t>STM32F407</w:t>
+      </w:r>
+      <w:r>
+        <w:rPr>
+          <w:rFonts w:cs="LM Roman Slanted 9" w:ascii="LM Roman Slanted 9" w:hAnsi="LM Roman Slanted 9"/>
+          <w:sz w:val="22"/>
+          <w:szCs w:val="22"/>
+          <w:rtl w:val="true"/>
+        </w:rPr>
+        <w:t xml:space="preserve"> </w:t>
+      </w:r>
+      <w:r>
+        <w:rPr>
+          <w:rFonts w:ascii="LM Roman Slanted 9" w:hAnsi="LM Roman Slanted 9" w:cs="LM Roman Slanted 9"/>
+          <w:sz w:val="22"/>
+          <w:sz w:val="22"/>
+          <w:szCs w:val="22"/>
+          <w:rtl w:val="true"/>
+        </w:rPr>
+        <w:t>تحمیل می‌کند و برای پیاده‌سازی اولیه سیستم مناسب‌تر است</w:t>
+      </w:r>
+      <w:r>
+        <w:rPr>
+          <w:rFonts w:cs="LM Roman Slanted 9" w:ascii="LM Roman Slanted 9" w:hAnsi="LM Roman Slanted 9"/>
+          <w:sz w:val="22"/>
+          <w:szCs w:val="22"/>
+          <w:rtl w:val="true"/>
+        </w:rPr>
+        <w:t xml:space="preserve">. </w:t>
+      </w:r>
+      <w:r>
+        <w:rPr>
+          <w:rFonts w:ascii="LM Roman Slanted 9" w:hAnsi="LM Roman Slanted 9" w:cs="LM Roman Slanted 9"/>
+          <w:sz w:val="22"/>
+          <w:sz w:val="22"/>
+          <w:szCs w:val="22"/>
+          <w:rtl w:val="true"/>
+        </w:rPr>
+        <w:t>پس از تأیید عملکرد نمونه اولیه، در صورت نیاز می‌توان روش نرم‌افزاری را نیز برای کاهش تعداد قطعات سخت‌افزاری بررسی کرد</w:t>
+      </w:r>
+      <w:r>
+        <w:rPr>
+          <w:rFonts w:cs="LM Roman Slanted 9" w:ascii="LM Roman Slanted 9" w:hAnsi="LM Roman Slanted 9"/>
+          <w:sz w:val="22"/>
+          <w:szCs w:val="22"/>
+          <w:rtl w:val="true"/>
+        </w:rPr>
+        <w:t>.</w:t>
+      </w:r>
+    </w:p>
+    <w:p>
+      <w:pPr>
+        <w:pStyle w:val="BodyText"/>
+        <w:bidi w:val="1"/>
+        <w:jc w:val="both"/>
+        <w:rPr>
+          <w:rFonts w:ascii="LM Roman Slanted 9" w:hAnsi="LM Roman Slanted 9" w:cs="LM Roman Slanted 9"/>
+          <w:sz w:val="22"/>
+          <w:szCs w:val="22"/>
+        </w:rPr>
+      </w:pPr>
+      <w:r>
+        <w:rPr>
+          <w:rFonts w:cs="LM Roman Slanted 9" w:ascii="LM Roman Slanted 9" w:hAnsi="LM Roman Slanted 9"/>
+          <w:sz w:val="22"/>
+          <w:szCs w:val="22"/>
+          <w:rtl w:val="true"/>
+        </w:rPr>
+      </w:r>
+    </w:p>
+    <w:p>
+      <w:pPr>
+        <w:pStyle w:val="BodyText"/>
+        <w:bidi w:val="1"/>
+        <w:jc w:val="both"/>
+        <w:rPr>
+          <w:rFonts w:ascii="LM Roman Slanted 9" w:hAnsi="LM Roman Slanted 9" w:cs="LM Roman Slanted 9"/>
+          <w:sz w:val="22"/>
+          <w:szCs w:val="22"/>
+        </w:rPr>
+      </w:pPr>
+      <w:r>
+        <w:rPr>
+          <w:rFonts w:cs="LM Roman Slanted 9" w:ascii="LM Roman Slanted 9" w:hAnsi="LM Roman Slanted 9"/>
+          <w:sz w:val="22"/>
+          <w:szCs w:val="22"/>
+          <w:rtl w:val="true"/>
+        </w:rPr>
+      </w:r>
+    </w:p>
+    <w:p>
+      <w:pPr>
+        <w:pStyle w:val="BodyText"/>
+        <w:bidi w:val="1"/>
+        <w:jc w:val="both"/>
+        <w:rPr>
+          <w:rFonts w:ascii="LM Roman Slanted 9" w:hAnsi="LM Roman Slanted 9" w:cs="LM Roman Slanted 9"/>
+          <w:sz w:val="22"/>
+          <w:szCs w:val="22"/>
+        </w:rPr>
+      </w:pPr>
+      <w:r>
+        <w:rPr>
+          <w:rFonts w:cs="LM Roman Slanted 9" w:ascii="LM Roman Slanted 9" w:hAnsi="LM Roman Slanted 9"/>
+          <w:sz w:val="22"/>
+          <w:szCs w:val="22"/>
+          <w:rtl w:val="true"/>
+        </w:rPr>
+        <w:drawing>
+          <wp:anchor behindDoc="0" distT="0" distB="0" distL="0" distR="0" simplePos="0" locked="0" layoutInCell="0" allowOverlap="1" relativeHeight="2">
+            <wp:simplePos x="0" y="0"/>
+            <wp:positionH relativeFrom="column">
+              <wp:posOffset>126365</wp:posOffset>
+            </wp:positionH>
+            <wp:positionV relativeFrom="paragraph">
+              <wp:posOffset>31115</wp:posOffset>
+            </wp:positionV>
+            <wp:extent cx="6028055" cy="4265295"/>
+            <wp:effectExtent l="0" t="0" r="0" b="0"/>
+            <wp:wrapSquare wrapText="largest"/>
+            <wp:docPr id="1" name="Image1" descr=""/>
+            <wp:cNvGraphicFramePr>
+              <a:graphicFrameLocks xmlns:a="http://schemas.openxmlformats.org/drawingml/2006/main" noChangeAspect="1"/>
+            </wp:cNvGraphicFramePr>
+            <a:graphic xmlns:a="http://schemas.openxmlformats.org/drawingml/2006/main">
+              <a:graphicData uri="http://schemas.openxmlformats.org/drawingml/2006/picture">
+                <pic:pic xmlns:pic="http://schemas.openxmlformats.org/drawingml/2006/picture">
+                  <pic:nvPicPr>
+                    <pic:cNvPr id="1" name="Image1" descr=""/>
+                    <pic:cNvPicPr>
+                      <a:picLocks noChangeAspect="1" noChangeArrowheads="1"/>
+                    </pic:cNvPicPr>
+                  </pic:nvPicPr>
+                  <pic:blipFill>
+                    <a:blip r:embed="rId2"/>
+                    <a:stretch>
+                      <a:fillRect/>
+                    </a:stretch>
+                  </pic:blipFill>
+                  <pic:spPr bwMode="auto">
+                    <a:xfrm>
+                      <a:off x="0" y="0"/>
+                      <a:ext cx="6028055" cy="4265295"/>
+                    </a:xfrm>
+                    <a:prstGeom prst="rect">
+                      <a:avLst/>
+                    </a:prstGeom>
+                    <a:noFill/>
+                  </pic:spPr>
+                </pic:pic>
+              </a:graphicData>
+            </a:graphic>
+          </wp:anchor>
+        </w:drawing>
+      </w:r>
+    </w:p>
+    <w:p>
+      <w:pPr>
+        <w:pStyle w:val="BodyText"/>
+        <w:bidi w:val="1"/>
+        <w:jc w:val="both"/>
+        <w:rPr>
+          <w:rFonts w:ascii="LM Roman Slanted 9" w:hAnsi="LM Roman Slanted 9" w:cs="LM Roman Slanted 9"/>
+          <w:sz w:val="22"/>
+          <w:szCs w:val="22"/>
+        </w:rPr>
+      </w:pPr>
+      <w:r>
+        <w:rPr>
+          <w:rFonts w:cs="LM Roman Slanted 9" w:ascii="LM Roman Slanted 9" w:hAnsi="LM Roman Slanted 9"/>
+          <w:sz w:val="22"/>
+          <w:szCs w:val="22"/>
+          <w:rtl w:val="true"/>
+        </w:rPr>
+      </w:r>
+    </w:p>
+    <w:p>
+      <w:pPr>
         <w:pStyle w:val="Normal"/>
+        <w:bidi w:val="1"/>
         <w:spacing w:before="0" w:after="0"/>
+        <w:jc w:val="both"/>
         <w:rPr>
           <w:b/>
           <w:i w:val="false"/>
@@ -5649,6 +6904,7 @@
           <w:b/>
           <w:i w:val="false"/>
           <w:sz w:val="32"/>
+          <w:rtl w:val="true"/>
         </w:rPr>
       </w:r>
     </w:p>
@@ -5787,14 +7043,106 @@
     </w:p>
     <w:p>
       <w:pPr>
+        <w:pStyle w:val="Normal"/>
+        <w:spacing w:before="0" w:after="0"/>
+        <w:rPr>
+          <w:b/>
+          <w:i w:val="false"/>
+          <w:i w:val="false"/>
+          <w:sz w:val="32"/>
+        </w:rPr>
+      </w:pPr>
+      <w:r>
+        <w:rPr>
+          <w:b/>
+          <w:i w:val="false"/>
+          <w:sz w:val="32"/>
+        </w:rPr>
+      </w:r>
+    </w:p>
+    <w:p>
+      <w:pPr>
+        <w:pStyle w:val="Normal"/>
+        <w:spacing w:before="0" w:after="0"/>
+        <w:rPr>
+          <w:b/>
+          <w:i w:val="false"/>
+          <w:i w:val="false"/>
+          <w:sz w:val="32"/>
+        </w:rPr>
+      </w:pPr>
+      <w:r>
+        <w:rPr>
+          <w:b/>
+          <w:i w:val="false"/>
+          <w:sz w:val="32"/>
+        </w:rPr>
+      </w:r>
+    </w:p>
+    <w:p>
+      <w:pPr>
+        <w:pStyle w:val="Normal"/>
+        <w:spacing w:before="0" w:after="0"/>
+        <w:rPr>
+          <w:b/>
+          <w:i w:val="false"/>
+          <w:i w:val="false"/>
+          <w:sz w:val="32"/>
+        </w:rPr>
+      </w:pPr>
+      <w:r>
+        <w:rPr>
+          <w:b/>
+          <w:i w:val="false"/>
+          <w:sz w:val="32"/>
+        </w:rPr>
+      </w:r>
+    </w:p>
+    <w:p>
+      <w:pPr>
+        <w:pStyle w:val="Normal"/>
+        <w:spacing w:before="0" w:after="0"/>
+        <w:rPr>
+          <w:b/>
+          <w:i w:val="false"/>
+          <w:i w:val="false"/>
+          <w:sz w:val="32"/>
+        </w:rPr>
+      </w:pPr>
+      <w:r>
+        <w:rPr>
+          <w:b/>
+          <w:i w:val="false"/>
+          <w:sz w:val="32"/>
+        </w:rPr>
+      </w:r>
+    </w:p>
+    <w:p>
+      <w:pPr>
+        <w:pStyle w:val="Normal"/>
+        <w:spacing w:before="0" w:after="0"/>
+        <w:rPr>
+          <w:b/>
+          <w:i w:val="false"/>
+          <w:i w:val="false"/>
+          <w:sz w:val="32"/>
+        </w:rPr>
+      </w:pPr>
+      <w:r>
+        <w:rPr>
+          <w:b/>
+          <w:i w:val="false"/>
+          <w:sz w:val="32"/>
+        </w:rPr>
+      </w:r>
+    </w:p>
+    <w:p>
+      <w:pPr>
         <w:pStyle w:val="Heading2"/>
+        <w:bidi w:val="1"/>
         <w:spacing w:before="0" w:after="0"/>
-        <w:rPr>
-          <w:b/>
-          <w:i w:val="false"/>
-          <w:i w:val="false"/>
-          <w:sz w:val="32"/>
-        </w:rPr>
+        <w:jc w:val="left"/>
+        <w:rPr/>
       </w:pPr>
       <w:r>
         <w:rPr>
@@ -5807,6 +7155,21 @@
           <w:rtl w:val="true"/>
         </w:rPr>
         <w:t>منابع</w:t>
+      </w:r>
+    </w:p>
+    <w:p>
+      <w:pPr>
+        <w:pStyle w:val="Normal"/>
+        <w:spacing w:before="0" w:after="0"/>
+        <w:rPr>
+          <w:b/>
+          <w:i w:val="false"/>
+          <w:i w:val="false"/>
+          <w:sz w:val="32"/>
+        </w:rPr>
+      </w:pPr>
+      <w:r>
+        <w:rPr/>
       </w:r>
     </w:p>
     <w:p>
@@ -5828,7 +7191,7 @@
         <w:t>SIMCom Wireless Solutions, “SIM5300E Hardware Design,” Version 1.09.</w:t>
         <w:br/>
       </w:r>
-      <w:hyperlink r:id="rId2">
+      <w:hyperlink r:id="rId3">
         <w:r>
           <w:rPr>
             <w:rStyle w:val="Hyperlink"/>
@@ -5840,7 +7203,7 @@
         <w:rPr/>
         <w:t xml:space="preserve"> (</w:t>
       </w:r>
-      <w:hyperlink r:id="rId3">
+      <w:hyperlink r:id="rId4">
         <w:r>
           <w:rPr>
             <w:rStyle w:val="Hyperlink"/>
@@ -5872,7 +7235,7 @@
         <w:t>STMicroelectronics, “STM32F405xx and STM32F407xx Datasheet.”</w:t>
         <w:br/>
       </w:r>
-      <w:hyperlink r:id="rId4">
+      <w:hyperlink r:id="rId5">
         <w:r>
           <w:rPr>
             <w:rStyle w:val="Hyperlink"/>
@@ -5884,7 +7247,7 @@
         <w:rPr/>
         <w:t xml:space="preserve"> (</w:t>
       </w:r>
-      <w:hyperlink r:id="rId5">
+      <w:hyperlink r:id="rId6">
         <w:r>
           <w:rPr>
             <w:rStyle w:val="Hyperlink"/>
@@ -5916,7 +7279,7 @@
         <w:t>Zarlink Semiconductor, “MT8870D/MT8870D-1 Integrated DTMF Receiver Datasheet.”</w:t>
         <w:br/>
       </w:r>
-      <w:hyperlink r:id="rId6">
+      <w:hyperlink r:id="rId7">
         <w:r>
           <w:rPr>
             <w:rStyle w:val="Hyperlink"/>
@@ -5928,7 +7291,7 @@
         <w:rPr/>
         <w:t xml:space="preserve"> (</w:t>
       </w:r>
-      <w:hyperlink r:id="rId7">
+      <w:hyperlink r:id="rId8">
         <w:r>
           <w:rPr>
             <w:rStyle w:val="Hyperlink"/>
@@ -5960,7 +7323,7 @@
         <w:t>Analog Devices, “Using the 73M2901CE DTMF Detector.”</w:t>
         <w:br/>
       </w:r>
-      <w:hyperlink r:id="rId8">
+      <w:hyperlink r:id="rId9">
         <w:r>
           <w:rPr>
             <w:rStyle w:val="Hyperlink"/>
@@ -5972,7 +7335,7 @@
         <w:rPr/>
         <w:t xml:space="preserve"> (</w:t>
       </w:r>
-      <w:hyperlink r:id="rId9">
+      <w:hyperlink r:id="rId10">
         <w:r>
           <w:rPr>
             <w:rStyle w:val="Hyperlink"/>
@@ -6004,7 +7367,7 @@
         <w:t>International Telecommunication Union, “Recommendation ITU-T Q.23: Technical Features of Push-Button Telephone Sets.”</w:t>
         <w:br/>
       </w:r>
-      <w:hyperlink r:id="rId10">
+      <w:hyperlink r:id="rId11">
         <w:r>
           <w:rPr>
             <w:rStyle w:val="Hyperlink"/>
@@ -6016,7 +7379,7 @@
         <w:rPr/>
         <w:t xml:space="preserve"> (</w:t>
       </w:r>
-      <w:hyperlink r:id="rId11">
+      <w:hyperlink r:id="rId12">
         <w:r>
           <w:rPr>
             <w:rStyle w:val="Hyperlink"/>
@@ -6049,9 +7412,9 @@
       </w:r>
     </w:p>
     <w:sectPr>
-      <w:footerReference w:type="even" r:id="rId12"/>
-      <w:footerReference w:type="default" r:id="rId13"/>
-      <w:footerReference w:type="first" r:id="rId14"/>
+      <w:footerReference w:type="even" r:id="rId13"/>
+      <w:footerReference w:type="default" r:id="rId14"/>
+      <w:footerReference w:type="first" r:id="rId15"/>
       <w:type w:val="nextPage"/>
       <w:pgSz w:w="12240" w:h="15840"/>
       <w:pgMar w:left="964" w:right="964" w:gutter="0" w:header="0" w:top="964" w:footer="720" w:bottom="964"/>
@@ -6126,7 +7489,7 @@
       <w:rPr>
         <w:rtl w:val="true"/>
       </w:rPr>
-      <w:t>4</w:t>
+      <w:t>5</w:t>
     </w:r>
     <w:r>
       <w:rPr>
@@ -6183,7 +7546,7 @@
       <w:rPr>
         <w:rtl w:val="true"/>
       </w:rPr>
-      <w:t>4</w:t>
+      <w:t>5</w:t>
     </w:r>
     <w:r>
       <w:rPr>

</xml_diff>